<commit_message>
Fix visual manual layout
</commit_message>
<xml_diff>
--- a/docs/guides/MAGI_一般使用者圖文操作手冊_2026-05-19.docx
+++ b/docs/guides/MAGI_一般使用者圖文操作手冊_2026-05-19.docx
@@ -52,7 +52,7 @@
           <w:color w:val="5D6B82"/>
           <w:sz w:val="18"/>
         </w:rPr>
-        <w:t>封面示意：MAGI 是案件、檔案、待辦、知識與健康狀態的共同入口。</w:t>
+        <w:t>封面示意：MAGI 把案件、檔案、待辦、知識資料與健康狀態整合在同一個入口。</w:t>
       </w:r>
     </w:p>
     <w:p>
@@ -402,7 +402,7 @@
                 <w:color w:val="1A2738"/>
                 <w:sz w:val="18"/>
               </w:rPr>
-              <w:t>案件、檔案、AI、法扶、法律資料如何串起來</w:t>
+              <w:t>案件、檔案、AI、法扶、法律資料如何彼此銜接</w:t>
             </w:r>
           </w:p>
         </w:tc>
@@ -485,7 +485,7 @@
                 <w:color w:val="1A2738"/>
                 <w:sz w:val="18"/>
               </w:rPr>
-              <w:t>OSC 待辦與行事曆事件分開閱讀</w:t>
+              <w:t>如何分開閱讀 OSC 建立待辦與行事曆事件</w:t>
             </w:r>
           </w:p>
         </w:tc>
@@ -1827,7 +1827,7 @@
       <w:r>
         <w:drawing>
           <wp:inline xmlns:a="http://schemas.openxmlformats.org/drawingml/2006/main" xmlns:pic="http://schemas.openxmlformats.org/drawingml/2006/picture">
-            <wp:extent cx="6035040" cy="3460090"/>
+            <wp:extent cx="6035040" cy="3057754"/>
             <wp:docPr id="3" name="Picture 3"/>
             <wp:cNvGraphicFramePr>
               <a:graphicFrameLocks noChangeAspect="1"/>
@@ -1848,7 +1848,7 @@
                   <pic:spPr>
                     <a:xfrm>
                       <a:off x="0" y="0"/>
-                      <a:ext cx="6035040" cy="3460090"/>
+                      <a:ext cx="6035040" cy="3057754"/>
                     </a:xfrm>
                     <a:prstGeom prst="rect"/>
                   </pic:spPr>
@@ -1870,7 +1870,7 @@
           <w:color w:val="5D6B82"/>
           <w:sz w:val="18"/>
         </w:rPr>
-        <w:t>圖 2：MAGI 的主要功能模組。</w:t>
+        <w:t>圖 2：MAGI 的主要功能模組與資料核心。</w:t>
       </w:r>
     </w:p>
     <w:p>
@@ -1955,7 +1955,7 @@
       <w:r>
         <w:drawing>
           <wp:inline xmlns:a="http://schemas.openxmlformats.org/drawingml/2006/main" xmlns:pic="http://schemas.openxmlformats.org/drawingml/2006/picture">
-            <wp:extent cx="6035040" cy="3621024"/>
+            <wp:extent cx="6035040" cy="3460090"/>
             <wp:docPr id="4" name="Picture 4"/>
             <wp:cNvGraphicFramePr>
               <a:graphicFrameLocks noChangeAspect="1"/>
@@ -1976,7 +1976,7 @@
                   <pic:spPr>
                     <a:xfrm>
                       <a:off x="0" y="0"/>
-                      <a:ext cx="6035040" cy="3621024"/>
+                      <a:ext cx="6035040" cy="3460090"/>
                     </a:xfrm>
                     <a:prstGeom prst="rect"/>
                   </pic:spPr>
@@ -1998,7 +1998,7 @@
           <w:color w:val="5D6B82"/>
           <w:sz w:val="18"/>
         </w:rPr>
-        <w:t>圖 3：安全示意畫面。實際畫面會依版本與權限不同。</w:t>
+        <w:t>圖 3：業務概覽應把 OSC 建立待辦與行事曆事件分成兩個清楚區塊。</w:t>
       </w:r>
     </w:p>
     <w:tbl>
@@ -2162,7 +2162,7 @@
                 <w:color w:val="1A2738"/>
                 <w:sz w:val="18"/>
               </w:rPr>
-              <w:t>看日期、案件編號、類型與描述。</w:t>
+              <w:t>看日期、案件編號、類型與描述；有期限但沒有明確開始時間者放這裡。</w:t>
             </w:r>
           </w:p>
         </w:tc>
@@ -2218,7 +2218,7 @@
                 <w:color w:val="1A2738"/>
                 <w:sz w:val="18"/>
               </w:rPr>
-              <w:t>由 Google Calendar 或匯入行程來的開庭、會議、電話</w:t>
+              <w:t>由 Google Calendar 或匯入行程產生的開庭、會議、電話</w:t>
             </w:r>
           </w:p>
         </w:tc>
@@ -2245,7 +2245,7 @@
                 <w:color w:val="1A2738"/>
                 <w:sz w:val="18"/>
               </w:rPr>
-              <w:t>看完整時間，不與 OSC 待辦混在同一框。</w:t>
+              <w:t>看完整日期與時間；不要和 OSC 建立待辦混在同一個框。</w:t>
             </w:r>
           </w:p>
         </w:tc>

</xml_diff>

<commit_message>
Refresh user manual mind map design
</commit_message>
<xml_diff>
--- a/docs/guides/MAGI_一般使用者圖文操作手冊_2026-05-19.docx
+++ b/docs/guides/MAGI_一般使用者圖文操作手冊_2026-05-19.docx
@@ -96,7 +96,7 @@
       <w:r>
         <w:drawing>
           <wp:inline xmlns:a="http://schemas.openxmlformats.org/drawingml/2006/main" xmlns:pic="http://schemas.openxmlformats.org/drawingml/2006/picture">
-            <wp:extent cx="6126480" cy="3522726"/>
+            <wp:extent cx="6126480" cy="3752469"/>
             <wp:docPr id="2" name="Picture 2"/>
             <wp:cNvGraphicFramePr>
               <a:graphicFrameLocks noChangeAspect="1"/>
@@ -117,7 +117,7 @@
                   <pic:spPr>
                     <a:xfrm>
                       <a:off x="0" y="0"/>
-                      <a:ext cx="6126480" cy="3522726"/>
+                      <a:ext cx="6126480" cy="3752469"/>
                     </a:xfrm>
                     <a:prstGeom prst="rect"/>
                   </pic:spPr>
@@ -9803,7 +9803,7 @@
         <w:rPr>
           <w:rFonts w:ascii="Arial" w:hAnsi="Arial" w:eastAsia="Microsoft JhengHei"/>
         </w:rPr>
-        <w:t>強制執行案件可用判決書資料夾內的執行命令作為結案依據。</w:t>
+        <w:t>強制執行案件可用「判決書或終局裁定及處分」資料夾內的執行命令作為結案依據；舊「判決書」資料夾仍相容讀取。</w:t>
       </w:r>
     </w:p>
     <w:p>

</xml_diff>

<commit_message>
Add verified MAGI user manual
</commit_message>
<xml_diff>
--- a/docs/guides/MAGI_一般使用者圖文操作手冊_2026-05-19.docx
+++ b/docs/guides/MAGI_一般使用者圖文操作手冊_2026-05-19.docx
@@ -6205,7 +6205,7 @@
               </w:rPr>
               <w:t>幫 2025-0121 高弘軒新增 6 月 1 日下午 4 點調解。</w:t>
               <w:br/>
-              <w:t>把黃彩庭進度回報 60 天後提醒。</w:t>
+              <w:t>把黃彩庭進度回報 90 天後提醒。</w:t>
             </w:r>
           </w:p>
         </w:tc>
@@ -6236,7 +6236,7 @@
         <w:rPr>
           <w:rFonts w:ascii="Arial" w:hAnsi="Arial" w:eastAsia="Microsoft JhengHei"/>
         </w:rPr>
-        <w:t>法扶進度回報冷卻提醒應依設定，例如 60 天。</w:t>
+        <w:t>法扶進度回報冷卻提醒應依設定；目前文件基準為 90 天。</w:t>
       </w:r>
     </w:p>
     <w:p>
@@ -9607,7 +9607,7 @@
         <w:rPr>
           <w:rFonts w:ascii="Arial" w:hAnsi="Arial" w:eastAsia="Microsoft JhengHei"/>
         </w:rPr>
-        <w:t>冷卻期間應依設定，例如 60 天。</w:t>
+        <w:t>冷卻期間應依設定；目前文件基準為 90 天。</w:t>
       </w:r>
     </w:p>
     <w:p>
@@ -19249,7 +19249,7 @@
               <w:br/>
               <w:t>檢查這件法扶案件能否結案。</w:t>
               <w:br/>
-              <w:t>這件已回報，請 60 天後再提醒。</w:t>
+              <w:t>這件已回報，請 90 天後再提醒。</w:t>
               <w:br/>
               <w:t>把 2026-0048 標示為已結案。</w:t>
             </w:r>
@@ -19441,7 +19441,7 @@
               <w:br/>
               <w:t>./venv/bin/python scripts/ops/run_test_suite.py --suite smoke62</w:t>
               <w:br/>
-              <w:t>./venv/bin/python scripts/ops/commercial_readiness_live.py --strict-public</w:t>
+              <w:t>./venv/bin/python scripts/ops/run_test_suite.py --suite commercial-release --json-out .runtime/commercial_release_latest.json</w:t>
             </w:r>
           </w:p>
         </w:tc>

</xml_diff>